<commit_message>
Update round44 with researcher-confirmed Free policy and gated PostgreSQL18 backup plan
</commit_message>
<xml_diff>
--- a/docs/acceptance/step6-round44/第44次反馈_验收与数据库保全报告.docx
+++ b/docs/acceptance/step6-round44/第44次反馈_验收与数据库保全报告.docx
@@ -7,151 +7,12 @@
         <w:pStyle w:val="Title"/>
       </w:pPr>
       <w:r>
-        <w:t>第44次反馈：Render环境核验与数据库保全</w:t>
+        <w:t>第44次报告更新：人工核验完成，PG18外部备份待批准</w:t>
       </w:r>
     </w:p>
     <w:p>
       <w:r>
-        <w:t>**结论：仍阻塞；本轮不部署。** 本轮只读核对仓库与附件，新增交付文档和本地测试证据；没有访问Render管理后台、连接线上数据库、重启服务、触发迁移、修改环境变量/API Key、升级资源、清库或重置账号。mentor_test_ready=false、formal_ready=false。</w:t>
-      </w:r>
-    </w:p>
-    <w:p>
-      <w:r>
-        <w:t>本轮日期：2026-10-22（北京时间）。按附件转述，数据库2026-11-19到期，距本轮查询日28天，存在数据删除风险；不能把未核实的宽限期当作保全保障。</w:t>
-      </w:r>
-    </w:p>
-    <w:p>
-      <w:pPr>
-        <w:pStyle w:val="Heading1"/>
-      </w:pPr>
-      <w:r>
-        <w:t>CONFIRMED FROM USER SCREENSHOTS</w:t>
-      </w:r>
-    </w:p>
-    <w:p>
-      <w:r>
-        <w:t>**证据边界**：本轮仅收到第44次DOCX，里面是截图事实的文字转述，没有嵌入截图；未另行收到第43次原截图/交付包。因此本节严格标为“附件对研究者截图的报告”，不是Codex重新登录Render验证。</w:t>
-      </w:r>
-    </w:p>
-    <w:p>
-      <w:r>
-        <w:t>附件报告：Web服务ai-agent-research-staging，Free、Docker、Singapore，仓库qianmengyan008-sys/AI-Agent-Research-Platform，分支work；Live短哈希ea9867d，前次ff87369，Dashboard手动部署成功。地址https://ai-agent-research-staging.onrender.com/；Dockerfile为./Dockerfile、context为根目录，Auto-Deploy Off，Health Check /api/ready，子域名Enabled。</w:t>
-      </w:r>
-    </w:p>
-    <w:p>
-      <w:r>
-        <w:t>附件报告Environment中ADMIN_ACCESS_TOKEN、ADMIN_DEVELOPMENT_MODE、DATABASE_URL、DB_POOL_SIZE、DEEPSEEK_API_KEY、DEEPSEEK_MODEL_NAME、GPT_API_BASE_URL、GPT_API_KEY键存在且值隐藏；GPT_MODEL_NAME区域仅在截图下缘部分可见，不推断完整列表或任何值。</w:t>
-      </w:r>
-    </w:p>
-    <w:p>
-      <w:r>
-        <w:t>数据库据附件转述为ai-agent-research-staging-db、Free、Available、PostgreSQL18、Singapore，约6.89%/1GB，提示2026-11-19到期且不升级会有删除风险，外部连接受入站规则限制。**同名数据库和DATABASE_URL键存在不能证明Web实际连接该库，也不能证明有可靠备份。**</w:t>
-      </w:r>
-    </w:p>
-    <w:p>
-      <w:pPr>
-        <w:pStyle w:val="Heading1"/>
-      </w:pPr>
-      <w:r>
-        <w:t>VERIFIED IN REPOSITORY</w:t>
-      </w:r>
-    </w:p>
-    <w:p>
-      <w:r>
-        <w:t>核验时本地及GitHub work为 **3f81fc143a99dc877aeb32829a6ea7d4e563ba0e**。第41次最终交付 **879d59184d771851e36a92b7d7601bc39dd99964**；其实现提交 **45b699fd3b9ed33d3939e3d025f27dea708703c2**，不能混称同一提交。本轮无新的业务实现，最终文档交付以round44-delivery标签为准（父提交3f81fc1）。</w:t>
-      </w:r>
-    </w:p>
-    <w:p>
-      <w:r>
-        <w:t>- ea9867d完整映射为`ea9867dfb9dd64778bdbaccf2cb3855ff27d9441`，提交标题Deliver feedback 35 evidence, screenshots, synthetic login workbook and complete round38 report。</w:t>
-      </w:r>
-    </w:p>
-    <w:p>
-      <w:r>
-        <w:t>- ff87369完整映射为`ff87369c55a27f8ff91b091d76767b8777cccaba`，标题Deliver round 37 screenshot-based payment and quotation evidence。到ea9867d有74个变更文件，其中增加账号管理/Excel、消息气泡及前轮证据，完整列表保存在repository-audit.json。</w:t>
-      </w:r>
-    </w:p>
-    <w:p>
-      <w:r>
-        <w:t>- ea9867d到核验时HEAD有6个后续提交、180个差异文件，其中35个非docs文件；逐文件精确列表和完整提交号见repository-audit.json。不能由部署标题直接推断已包含后续功能。</w:t>
-      </w:r>
-    </w:p>
-    <w:p>
-      <w:r>
-        <w:t>| 后续提交 | ea9867d尚未包含的内容                                                  |</w:t>
-      </w:r>
-    </w:p>
-    <w:p>
-      <w:r>
-        <w:t>| -------- | ---------------------------------------------------------------------- |</w:t>
-      </w:r>
-    </w:p>
-    <w:p>
-      <w:r>
-        <w:t>| 3ee1940  | 第39轮服务端聊天驱动、持久开场/卡片、完整管理员历史及004聊天通知迁移。 |</w:t>
-      </w:r>
-    </w:p>
-    <w:p>
-      <w:r>
-        <w:t>| c21f903  | 第40轮日常四身份/短回复、情感短气泡与归属、日常持续使用及相应回归。    |</w:t>
-      </w:r>
-    </w:p>
-    <w:p>
-      <w:r>
-        <w:t>| da385a1  | 第39/40轮证据及交付报告。                                              |</w:t>
-      </w:r>
-    </w:p>
-    <w:p>
-      <w:r>
-        <w:t>| 45b699f  | 第41轮只读验收闸门、10项测试与CI证据保存。                             |</w:t>
-      </w:r>
-    </w:p>
-    <w:p>
-      <w:r>
-        <w:t>| 879d591  | 第41轮最终文档/验收证据。                                              |</w:t>
-      </w:r>
-    </w:p>
-    <w:p>
-      <w:r>
-        <w:t>| 3f81fc1  | 第42轮只读核验文档与本地回归证据。                                     |</w:t>
-      </w:r>
-    </w:p>
-    <w:p>
-      <w:r>
-        <w:t>按附件所报Live=ea9867d，其Git内容**不包含上述后续修改**，与work HEAD不一致；当前实际后台Live是否仍为该值未重新访问确认。render.yaml、Dockerfile、核心experiment-core、原ai-orchestrator及research材料从ea9867d到核验HEAD无差异。</w:t>
-      </w:r>
-    </w:p>
-    <w:p>
-      <w:r>
-        <w:t>**第43轮缺口**：当前work的docs目录与本地标签中未找到第43轮报告/标签，本轮也未收到第43轮文件或原截图；不编造对应提交和报告，不覆盖第41、42轮历史。DOCX中的第43轮事实仅保留其原文及来源说明。整个项目ZIP包含仓库已有历史及本轮成果，不冒称包含未提供的第43轮原包。</w:t>
-      </w:r>
-    </w:p>
-    <w:p>
-      <w:pPr>
-        <w:pStyle w:val="Heading2"/>
-      </w:pPr>
-      <w:r>
-        <w:t>连接、启动、迁移及健康检查</w:t>
-      </w:r>
-    </w:p>
-    <w:p>
-      <w:r>
-        <w:t>Dockerfile构建执行npm ci和npm run build，运行入口是`node --use-env-proxy --import tsx scripts/hosted-server.mjs`。该入口调用createHostedDeployment；`scripts/hosted-platform.mjs`从**DATABASE_URL**读取pg.Pool连接（必须存在），DB_POOL_SIZE只控制池上限，默认10、连接超时10秒。render.yaml声明数据库引用只是期望配置，不证明实际已注入的目标。</w:t>
-      </w:r>
-    </w:p>
-    <w:p>
-      <w:r>
-        <w:t>启动先检查数据库隔离，再加载database/migrations并执行migrate默认up。迁移通过advisory lock串行化、核对research_meta.schema_migration中的id/checksum，按事务应用待执行迁移。其后会在锁下执行固定测试实验/账号bootstrap：复用已有记录并校验哈希/分组，缺失时会创建。**所以启动/重启应用不是纯只读动作**，本轮没有为验证而启动线上服务。packages/database/src/cli.ts也从DATABASE_URL读取，up/down均不是当前授权操作。</w:t>
-      </w:r>
-    </w:p>
-    <w:p>
-      <w:r>
-        <w:t>004只新增chat_notice及不可变约束；源库实际迁移账本未取得，不能断言004已应用或未应用。旧ea9867d只含001–003；004有记录后down拒绝，旧应用不认识004，不能盲目Rollback或删除数据来回退。</w:t>
-      </w:r>
-    </w:p>
-    <w:p>
-      <w:r>
-        <w:t>`/api/ready`仅执行池连接上的`SELECT 1`：成功返回status=ready/database=ok，失败503 DATABASE_UNAVAILABLE。它不核实目标数据库身份、账号/评分/历史完整性、备份可恢复性或迁移账本。上述代码在ea9867d与核验HEAD均存在。本轮没有探测该线上URL，以免冷启动间接触发启动流程。</w:t>
+        <w:t>**结论：仍阻塞；不部署，不修改资源。** 本次补充仅更新文档，不连接线上数据库、不开放网络、不创建恢复实例、不升级、不改Secret、不清库/重置账号、不执行迁移。初版第44轮报告/状态/方案已保存在researcher-followup/initial-*，原round44-delivery标签不变。</w:t>
       </w:r>
     </w:p>
     <w:p>
@@ -164,12 +25,27 @@
     </w:p>
     <w:p>
       <w:r>
-        <w:t>仅据附件，研究者已完成Web General/Build/Deploy/Environment查看；**不要求再次重复Web设置核验**。这些结果的来源是研究者报告，Codex无独立后台访问证据。</w:t>
+        <w:t>研究者本轮直接确认：数据库ai-agent-research-staging-db；PostgreSQL18，Free，Available，Singapore (Southeast Asia)，约6.89%/1GB，数据库名ai_agent_research。</w:t>
       </w:r>
     </w:p>
     <w:p>
       <w:r>
-        <w:t>当前唯一必要手动检查：Render → 原项目 → **ai-agent-research-staging-db**详情 → 只查看Backups/Recovery/下载备份或类似入口，返回是否找到、备份时间/频率、保留或恢复范围、升级/到期/付费提示。见[manual-checklist.md](manual-checklist.md)。不要点Restore/Delete/Upgrade/Suspend/Restart，不发送密码、连接串、Token或Key；找不到就写“数据库详情页未找到备份/恢复入口”，不据此断言平台无备份能力。实际结果仍待研究者返回。</w:t>
+        <w:t>已检查详情页，**未找到Backups、Recovery、下载备份或类似入口**；备份时间/频率、保留期限/可恢复范围未显示。该人工核验已经完成，**不再要求寻找这些页面或重复Web设置核验**。</w:t>
+      </w:r>
+    </w:p>
+    <w:p>
+      <w:r>
+        <w:t>页面原文：“Your database will expire on November 19, 2026. The database will be deleted unless you upgrade to a paid compute plan.” 应在**2026-11-19到期前**完成外部备份和隔离恢复验证。</w:t>
+      </w:r>
+    </w:p>
+    <w:p>
+      <w:r>
+        <w:t>Web DATABASE_URL键存在且保持隐藏；研究者没有展开/发送Secret。外部连接受PostgreSQL inbound IP rules限制，External Database URL/PSQL Command目前不可直接使用。研究者未修改Networking，未点击升级、恢复、删除、挂起、重启、部署或回滚。</w:t>
+      </w:r>
+    </w:p>
+    <w:p>
+      <w:r>
+        <w:t>本节证据是研究者直接人工反馈，完整脱敏记录见docs/inputs/round44-researcher-verification.md；Codex没有独立登录Render后台。Web实际连接目标与该数据库的关联仍未取得可核实证据，不能从同名资源推断。</w:t>
       </w:r>
     </w:p>
     <w:p>
@@ -182,32 +58,32 @@
     </w:p>
     <w:p>
       <w:r>
-        <w:t>**本轮未能取得官方当前文档正文：NOT VERIFIED。** 查询日期2026-10-22，访问以下官方文档URL初次及提权重试均报Tunnel connection failed: 403 Forbidden：</w:t>
+        <w:t>**已由官方文档确认；证据渠道：研究者提供GPT对当前官方文档的核验结果。** 此项已从初版NOT VERIFIED更新，不再把Free是否提供备份/恢复列为未知。</w:t>
       </w:r>
     </w:p>
     <w:p>
       <w:r>
-        <w:t>- https://render.com/docs/free</w:t>
+        <w:t>1. Free Render Postgres不提供recovery capabilities。</w:t>
       </w:r>
     </w:p>
     <w:p>
       <w:r>
-        <w:t>- https://render.com/docs/postgresql-backups</w:t>
+        <w:t>2. Free Render Postgres不创建logical backups。</w:t>
       </w:r>
     </w:p>
     <w:p>
       <w:r>
-        <w:t>- https://render.com/docs/postgresql-creating-connecting</w:t>
+        <w:t>3. 需要自行使用pg_dump等方式进行外部备份。</w:t>
       </w:r>
     </w:p>
     <w:p>
       <w:r>
-        <w:t>- https://render.com/docs/postgresql-version-upgrades</w:t>
+        <w:t>4. 创建30天后到期，到期有14天升级宽限期，之后数据库及数据删除。</w:t>
       </w:r>
     </w:p>
     <w:p>
       <w:r>
-        <w:t>尝试通过GitHub获取文档也未成功，见official-docs-attempts.json。以上是**待核实的官方来源链接，不是本轮已读证据**。未据记忆补写Free备份可用性、精确保留期、到期宽限/删除规则或报价。附件报告的到期提示仍应作为需要尽快保全的风险处理。官方政策核实是本轮未完成项，不宣称验收全部通过。</w:t>
+        <w:t>相关官方来源：https://render.com/docs/free 、https://render.com/docs/postgresql-backups 。Codex本环境此前请求403的记录仍保存在official-docs-attempts.json；这份失败记录仅描述**Codex直接抓取通道**，不否定研究者提供的官方文档核验。未冒称本环境已重新读取到原文；GPT逐字正文与独立查询日期本轮未另附。14天宽限不是可依赖的可连接/备份窗口，不等到到期后再导出，也不将其当作免费恢复能力。</w:t>
       </w:r>
     </w:p>
     <w:p>
@@ -215,22 +91,72 @@
         <w:pStyle w:val="Heading1"/>
       </w:pPr>
       <w:r>
-        <w:t>本轮测试及实际验收</w:t>
+        <w:t>VERIFIED IN REPOSITORY：Live与交付关系</w:t>
       </w:r>
     </w:p>
     <w:p>
       <w:r>
-        <w:t>完整 `npm run check` 退出0：**505项Vitest /33文件、25项Playwright通过**，失败0、跳过0；包含类型、lint、格式、构建、认知/情感/日常、账号隔离及本地备份恢复回归。见full-check.log/browser-results.json。没有新增/放宽测试断言，也没有本轮自动化失败运行。此前失败日志保留在原轮目录。</w:t>
+        <w:t>本次核验前GitHub work HEAD与当前初版第44轮交付均为 **24fe003aa06fbf2d9c427fac25081f99977edaa6**。研究者确认的Live短哈希ea9867d在Git中唯一映射为 **ea9867dfb9dd64778bdbaccf2cb3855ff27d9441**，**二者不一致**。</w:t>
       </w:r>
     </w:p>
     <w:p>
       <w:r>
-        <w:t>测试仍为本地合成数据与测试模型替身。本轮真实模型调用0，真实模型完整三路径与人工语义审核NOT RUN；线上人工smoke、线上旧账号复验NOT RUN。既有数据库恢复用本地PostgreSQL17合成实例，不能替代附件所报PostgreSQL18源库的备份/恢复验收，也不等于异地恢复。</w:t>
+        <w:t>从Live到核验HEAD有7个后续提交、194个差异文件；其中非docs变更仍为35个。精确文件/提交列表见researcher-followup/repository-audit.json。</w:t>
       </w:r>
     </w:p>
     <w:p>
       <w:r>
-        <w:t>本轮只新增docs/inputs/round44-feedback.docx、提取原文round44-requirements.md及docs/acceptance/step6-round44/内报告、状态、只读清单、差异记录、官方请求失败记录、保全计划和测试日志；不改旧报告。业务代码、研究材料、状态机、Validator、运行时Prompt、参数、账号/分组、数据库结构、迁移、环境变量、API Key、render.yaml、Dockerfile均**未修改**。</w:t>
+        <w:t>| 提交    | Live尚未包含的后续内容                                 |</w:t>
+      </w:r>
+    </w:p>
+    <w:p>
+      <w:r>
+        <w:t>| ------- | ------------------------------------------------------ |</w:t>
+      </w:r>
+    </w:p>
+    <w:p>
+      <w:r>
+        <w:t>| 3ee1940 | 第39轮聊天驱动、持久开场/卡片、完整历史及004通知迁移。 |</w:t>
+      </w:r>
+    </w:p>
+    <w:p>
+      <w:r>
+        <w:t>| c21f903 | 第40轮日常四身份/短回复、情感短气泡与归属、持续历史。  |</w:t>
+      </w:r>
+    </w:p>
+    <w:p>
+      <w:r>
+        <w:t>| da385a1 | 第39/40轮完整交付证据。                                |</w:t>
+      </w:r>
+    </w:p>
+    <w:p>
+      <w:r>
+        <w:t>| 45b699f | 第41轮验收闸门与CI证据保存实现。                       |</w:t>
+      </w:r>
+    </w:p>
+    <w:p>
+      <w:r>
+        <w:t>| 879d591 | 第41轮最终交付，区别于实现45b699f。                    |</w:t>
+      </w:r>
+    </w:p>
+    <w:p>
+      <w:r>
+        <w:t>| 3f81fc1 | 第42轮只读核验交付。                                   |</w:t>
+      </w:r>
+    </w:p>
+    <w:p>
+      <w:r>
+        <w:t>| 24fe003 | 第44轮初版报告/反馈/方案，未上线。                     |</w:t>
+      </w:r>
+    </w:p>
+    <w:p>
+      <w:r>
+        <w:t>本次补充交付以 **round44-followup-delivery** 标签标识，父提交24fe003，仅更新文档，不把补充报告提交混称为线上版本。原round44-delivery和其他历史标签保留；当前仓库没有第43轮原包，仍不编造或覆盖它。</w:t>
+      </w:r>
+    </w:p>
+    <w:p>
+      <w:r>
+        <w:t>Docker入口仍为scripts/hosted-server.mjs，调用hosted-platform.mjs，从DATABASE_URL读取pg.Pool。启动会自动检查/应用迁移并执行bootstrap，故启动/重启不是只读核验。/api/ready只SELECT 1，不能证明源库身份、账号历史或备份完整。render.yaml的autoDeploy=false未修改；不触发手动部署。当前实际线上迁移账本未知，不能仅按Live代码推断它必为001–003。</w:t>
       </w:r>
     </w:p>
     <w:p>
@@ -238,12 +164,32 @@
         <w:pStyle w:val="Heading1"/>
       </w:pPr>
       <w:r>
-        <w:t>NOT VERIFIED</w:t>
+        <w:t>PostgreSQL18备份与隔离恢复设计</w:t>
       </w:r>
     </w:p>
     <w:p>
       <w:r>
-        <w:t>实际Web连接目标、当前后台Live完整哈希、线上迁移账本、完整数据库备份与SHA256/私有位置、线上或异地隔离恢复、旧账号基线、当前Free备份/导出/PITR能力及保留政策、PostgreSQL18实测恢复均未验证。第43轮原包和原截图未提供。原四头像、真实模型完整三路径、人评、30人托管并发、14自然日续用/批准替代方案及隐私/招募审批仍独立阻塞。</w:t>
+        <w:t>详见[backup-restore-plan.md](backup-restore-plan.md)，包含完整范围、命令骨架、快照边界、校验标准、费用风险和分工。方案**尚未执行**。</w:t>
+      </w:r>
+    </w:p>
+    <w:p>
+      <w:r>
+        <w:t>优先路径A：研究者已有受控电脑，匹配PG18客户端与私有磁盘，若后续明确批准，仅临时允许稳定出口的单一IP；不升级Render、不建Render新服务。当前外部连接受阻，不能承诺在完全不改变访问条件时立即导出。既有可访问内部受控环境是候选B，但可用性尚未证实，不假设Free有Shell，也不添加公开HTTP导出接口绕过限制。</w:t>
+      </w:r>
+    </w:p>
+    <w:p>
+      <w:r>
+        <w:t>获批准后的完整流程：私下确认Web/源库目标；凭据只在本机受控文件/Secret中配置；用同一只读快照采集基线并完整custom pg_dump；覆盖research及research_meta、账号哈希、分配、会话、消息/通知、状态/事件/评分/变量、配置、审计、约束与迁移账本；AES256GCM加密私存，密钥分开，记录UTC/北京时间、源标识、密文SHA256/大小及快照边界。只读dump仍有连接、锁及I/O压力，应限时监控，不能声称零运行影响。</w:t>
+      </w:r>
+    </w:p>
+    <w:p>
+      <w:r>
+        <w:t>恢复只在**另行批准的独立PG18空目标**进行：从最终密文取回、SHA256与GCM校验、事务恢复，核对同快照表计数/分块摘要、约束/序列/账本及业务关联。原样核对前不启动Hosted应用；第二个批准副本才运行与账本兼容的代码，关闭真实模型，用既有测试账号实际登录并核对分组/历史/评分/隔离。源库不重置密码，不运行恢复或down。Postgres角色/ACL映射另记，不能把no-owner/no-acl导出说成全实例权限也已原样恢复。</w:t>
+      </w:r>
+    </w:p>
+    <w:p>
+      <w:r>
+        <w:t>现有production-backup-job.mjs固定PG17与专用production库/scope，**不能直接用于PG18 staging，也不能改scope绕过保护**。此前本地PG17合成恢复PASS不代表本次PG18或线上恢复通过。</w:t>
       </w:r>
     </w:p>
     <w:p>
@@ -251,22 +197,85 @@
         <w:pStyle w:val="Heading1"/>
       </w:pPr>
       <w:r>
-        <w:t>保全方案与后续顺序</w:t>
+        <w:t>谁能做什么，哪些步骤需要批准</w:t>
       </w:r>
     </w:p>
     <w:p>
       <w:r>
-        <w:t>[backup-restore-plan.md](backup-restore-plan.md)提供待批准的分步方案：先确认源库关联与连接权限；匹配Postgres18工具及独立18恢复目标；完整dump包含research和research_meta迁移账本、账号哈希、分配、消息/通知、状态/事件/评分/变量、配置/审计与约束；加密私存、密钥分开、记录密文SHA256；在不覆盖原staging的隔离目标恢复，先比表计数/约束/快照，再在另一个授权隔离副本验证旧测试账号/分组/历史/评分。先不启动Hosted应用以免自动迁移和bootstrap改变恢复基线。</w:t>
+        <w:t>| 事项                             | Codex当前权限内                                                   | 必须由研究者/授权受控环境完成                                                                                   |</w:t>
       </w:r>
     </w:p>
     <w:p>
       <w:r>
-        <w:t>该方案**未执行**。现有production备份脚本固定专用production库/scope及PG17，禁止直接用于PG18 staging或改scope绕过保护。若需要开放网络、付费或创建资源，先说明实际选项、费用/风险及替代方案，再等待明确批准；不自行升级。只有实际完成恢复后才可说备份可靠。</w:t>
+        <w:t>| -------------------------------- | ----------------------------------------------------------------- | --------------------------------------------------------------------------------------------------------------- |</w:t>
       </w:r>
     </w:p>
     <w:p>
       <w:r>
-        <w:t>**现在不部署、不请求部署批准**：先收唯一人工备份入口结果并补足官方政策/关联证据，再确定安全备份操作。所有数据保全条件与迁移兼容性核实后，才请求一次明确部署批准。本轮GitHub与ZIP是代码/反馈/证据交付，不包含真实研究数据库备份、密钥或线上账号密码，也不代表新版本已上线。</w:t>
+        <w:t>| 仓库对比、schema审阅、方案与报告 | 已完成；无线上访问                                                | 不用重复找备份页面。                                                                                            |</w:t>
+      </w:r>
+    </w:p>
+    <w:p>
+      <w:r>
+        <w:t>| 网络访问                         | 只能提出最小规则和风险；当前不改                                  | 决定是否批准精确临时IP/期限；批准后本人在Render添加并撤销该规则，保留原规则，不开放0.0.0.0/0。                  |</w:t>
+      </w:r>
+    </w:p>
+    <w:p>
+      <w:r>
+        <w:t>| Secret与源库关联                 | 不索要聊天连接串/密码                                             | 本人私下配置并核实目标，不改Web DATABASE_URL/API Key。                                                          |</w:t>
+      </w:r>
+    </w:p>
+    <w:p>
+      <w:r>
+        <w:t>| 导出/加密/校验                   | 具备明确授权、受控访问和安全存储后才可执行或给出命令，当前NOT RUN | 选择机器/OS、私有存储与密钥保管；本机执行时由研究者按指导操作。                                                 |</w:t>
+      </w:r>
+    </w:p>
+    <w:p>
+      <w:r>
+        <w:t>| 隔离恢复                         | 计划已完成，当前不创建实例                                        | 另行批准具体本地/已有受控恢复资源；用私有旧测试账号验收。                                                       |</w:t>
+      </w:r>
+    </w:p>
+    <w:p>
+      <w:r>
+        <w:t>| 费用                             | 不购买、不升级，不声称总费用零                                    | 开源PG18无许可费；使用已有机器无需新增云实例，但流量/存储计费及额度需先核实。任何新增费用必须先确认报价并批准。 |</w:t>
+      </w:r>
+    </w:p>
+    <w:p>
+      <w:r>
+        <w:t>| 部署                             | 继续禁止                                                          | 备份、恢复、关联、旧账号与迁移证据齐全后另行决定；备份批准不等于部署批准。                                      |</w:t>
+      </w:r>
+    </w:p>
+    <w:p>
+      <w:r>
+        <w:t>当前无需点击任何按钮或运行命令。若采纳A路径，下一组仅先确认受控电脑/OS、稳定出口与已有私有存储条件，不发送Secret；再给出具体网络/资源/费用清单并请求执行批准。</w:t>
+      </w:r>
+    </w:p>
+    <w:p>
+      <w:pPr>
+        <w:pStyle w:val="Heading1"/>
+      </w:pPr>
+      <w:r>
+        <w:t>测试、改动和剩余阻塞</w:t>
+      </w:r>
+    </w:p>
+    <w:p>
+      <w:r>
+        <w:t>本次补充**仅改文档**，没有新增代码/迁移或修改实验材料、状态机、Validator、Prompt、研究参数、API Key、数据库、账号/分组、render.yaml或Dockerfile。</w:t>
+      </w:r>
+    </w:p>
+    <w:p>
+      <w:r>
+        <w:t>初版第44轮完整npm run check退出0、505项Vitest/33文件及25项浏览器通过的原日志继续保留；**它是初版工程回归，未在本次文档补充中重跑或当作新测试**。本次执行文档格式、状态一致性、变更范围与打包校验，记录在researcher-followup/。本次未执行PG18 dump/restore、线上登录、人评或真实模型调用。自动化失败记录没有删除。</w:t>
+      </w:r>
+    </w:p>
+    <w:p>
+      <w:r>
+        <w:t>Free平台能力与人工页面核验已完成；仍未完成的是源目标关联/实际迁移账本、经授权的访问路径、真实完整备份文件/SHA256/私有位置、PG18隔离/异地恢复、旧账号基线。本轮不把“无托管备份”推断为必须付费升级，也不继续要求找按钮。</w:t>
+      </w:r>
+    </w:p>
+    <w:p>
+      <w:r>
+        <w:t>原头像、真实模型三路径与人评、30人托管并发、14自然日/批准替代方案及隐私/招募审批仍为独立阻塞。**仍阻塞，不部署。**</w:t>
       </w:r>
     </w:p>
     <w:sectPr>

</xml_diff>